<commit_message>
Update AI audit draft and ISTQB error notes
</commit_message>
<xml_diff>
--- a/AI_Forms_Drafts/AI-02_Audit_Draft.docx
+++ b/AI_Forms_Drafts/AI-02_Audit_Draft.docx
@@ -42208,7 +42208,7 @@
         <w:rPr>
           <w:sz w:val="16"/>
         </w:rPr>
-        <w:t xml:space="preserve">SỬA: tạo bản sơ đồ hình từ nội dung này. Bản PNG hiện có ở Mindmap_QA_QC_ISTQB.png; vẫn cần bạn tự chốt 3 lỗi nội dung và bản sửa trước khi nộp.</w:t>
+        <w:t xml:space="preserve">SỬA: chuyển nội dung Markdown thành sơ đồ dạng hình. Bản PNG hiện có ở Mindmap_QA_QC_ISTQB.png. Phần phân tích ba lỗi của mindmap là yêu cầu riêng của HW01, trình bày trong main report; không phải trường dữ liệu bổ sung của AI-02.</w:t>
       </w:r>
     </w:p>
     <w:p>
@@ -42610,7 +42610,7 @@
         <w:rPr>
           <w:sz w:val="16"/>
         </w:rPr>
-        <w:t xml:space="preserve">SỬA CẦN LÀM: khôi phục/lưu nguồn sơ đồ có thể chỉnh sửa; bố trí lại nhãn không chồng; sinh viên đối chiếu 3 lỗi nội dung với ISTQB §1.2.2, §1.4.1 rồi sửa hình. Giữ PNG gốc để chứng minh đầu ra AI.</w:t>
+        <w:t xml:space="preserve">SỬA CẦN LÀM: khôi phục/lưu nguồn sơ đồ có thể chỉnh sửa; bố trí lại nhãn chồng nhau và giữ PNG gốc để chứng minh đầu ra AI. Phần phân tích ba lỗi theo yêu cầu G9.1 thuộc main report, tách khỏi trường đánh giá artifact của AI-02.</w:t>
       </w:r>
     </w:p>
     <w:p>

</xml_diff>